<commit_message>
fix(templates): remove texto 'Testemunha 1/2' do venda_vista_master.docx e conserta linha do sublinhado que faltava na testemunha 2 - o sistema já gera essa área dinamicamente via BLOCO_TESTEMUNHAS
</commit_message>
<xml_diff>
--- a/templates/venda_vista_master.docx
+++ b/templates/venda_vista_master.docx
@@ -916,20 +916,6 @@
           <w:szCs w:val="24"/>
         </w:rPr>
       </w:pPr>
-      <w:r>
-        <w:rPr>
-          <w:sz w:val="24"/>
-          <w:szCs w:val="24"/>
-        </w:rPr>
-        <w:t>Testemunha 1:</w:t>
-      </w:r>
-      <w:r>
-        <w:rPr>
-          <w:sz w:val="24"/>
-          <w:szCs w:val="24"/>
-        </w:rPr>
-        <w:br/>
-      </w:r>
     </w:p>
     <w:p>
       <w:pPr>
@@ -937,6 +923,15 @@
         <w:rPr>
           <w:sz w:val="24"/>
           <w:szCs w:val="24"/>
+        </w:rPr>
+      </w:pPr>
+    </w:p>
+    <w:p>
+      <w:pPr>
+        <w:jc w:val="center"/>
+        <w:rPr>
+          <w:sz w:val="24"/>
+          <w:szCs w:val="24"/>
           <w:u w:val="single"/>
         </w:rPr>
       </w:pPr>
@@ -946,7 +941,7 @@
           <w:szCs w:val="24"/>
           <w:u w:val="single"/>
         </w:rPr>
-        <w:t>__________________________________</w:t>
+        <w:tab/>
       </w:r>
       <w:r>
         <w:rPr>
@@ -980,6 +975,30 @@
         </w:rPr>
         <w:tab/>
       </w:r>
+      <w:r>
+        <w:rPr>
+          <w:sz w:val="24"/>
+          <w:szCs w:val="24"/>
+          <w:u w:val="single"/>
+        </w:rPr>
+        <w:tab/>
+      </w:r>
+      <w:r>
+        <w:rPr>
+          <w:sz w:val="24"/>
+          <w:szCs w:val="24"/>
+          <w:u w:val="single"/>
+        </w:rPr>
+        <w:tab/>
+      </w:r>
+      <w:r>
+        <w:rPr>
+          <w:sz w:val="24"/>
+          <w:szCs w:val="24"/>
+          <w:u w:val="single"/>
+        </w:rPr>
+        <w:tab/>
+      </w:r>
     </w:p>
     <w:p>
       <w:pPr>
@@ -989,13 +1008,6 @@
           <w:szCs w:val="24"/>
         </w:rPr>
       </w:pPr>
-      <w:r>
-        <w:rPr>
-          <w:sz w:val="24"/>
-          <w:szCs w:val="24"/>
-        </w:rPr>
-        <w:t>Testemunha 2:</w:t>
-      </w:r>
     </w:p>
     <w:p>
       <w:pPr>
@@ -1005,6 +1017,89 @@
           <w:szCs w:val="24"/>
         </w:rPr>
       </w:pPr>
+    </w:p>
+    <w:p>
+      <w:pPr>
+        <w:jc w:val="center"/>
+        <w:rPr>
+          <w:sz w:val="24"/>
+          <w:szCs w:val="24"/>
+        </w:rPr>
+      </w:pPr>
+    </w:p>
+    <w:p>
+      <w:pPr>
+        <w:jc w:val="center"/>
+        <w:rPr>
+          <w:sz w:val="24"/>
+          <w:szCs w:val="24"/>
+          <w:u w:val="single"/>
+        </w:rPr>
+      </w:pPr>
+      <w:r>
+        <w:rPr>
+          <w:sz w:val="24"/>
+          <w:szCs w:val="24"/>
+          <w:u w:val="single"/>
+        </w:rPr>
+        <w:tab/>
+      </w:r>
+      <w:r>
+        <w:rPr>
+          <w:sz w:val="24"/>
+          <w:szCs w:val="24"/>
+          <w:u w:val="single"/>
+        </w:rPr>
+        <w:tab/>
+      </w:r>
+      <w:r>
+        <w:rPr>
+          <w:sz w:val="24"/>
+          <w:szCs w:val="24"/>
+          <w:u w:val="single"/>
+        </w:rPr>
+        <w:tab/>
+      </w:r>
+      <w:r>
+        <w:rPr>
+          <w:sz w:val="24"/>
+          <w:szCs w:val="24"/>
+          <w:u w:val="single"/>
+        </w:rPr>
+        <w:tab/>
+      </w:r>
+      <w:r>
+        <w:rPr>
+          <w:sz w:val="24"/>
+          <w:szCs w:val="24"/>
+          <w:u w:val="single"/>
+        </w:rPr>
+        <w:tab/>
+      </w:r>
+      <w:r>
+        <w:rPr>
+          <w:sz w:val="24"/>
+          <w:szCs w:val="24"/>
+          <w:u w:val="single"/>
+        </w:rPr>
+        <w:tab/>
+      </w:r>
+      <w:r>
+        <w:rPr>
+          <w:sz w:val="24"/>
+          <w:szCs w:val="24"/>
+          <w:u w:val="single"/>
+        </w:rPr>
+        <w:tab/>
+      </w:r>
+      <w:r>
+        <w:rPr>
+          <w:sz w:val="24"/>
+          <w:szCs w:val="24"/>
+          <w:u w:val="single"/>
+        </w:rPr>
+        <w:tab/>
+      </w:r>
     </w:p>
     <w:p>
       <w:r>

</xml_diff>

<commit_message>
feat(template): adicionar rotulos 'Testemunha 1:' e 'Testemunha 2:' no bloco de testemunhas
O bloco {{BLOCO_TESTEMUNHAS_INICIO}}...{{BLOCO_TESTEMUNHAS_FIM}} do
arquivo mestre de venda a vista tinha as duas linhas sublinhadas pra
assinatura das testemunhas, mas sem nenhum texto identificando qual
linha e de qual testemunha. Adicionado 'Testemunha 1:' acima da
primeira linha e 'Testemunha 2:' acima da segunda, no mesmo estilo
(centralizado, sem negrito, tamanho 24) usado no template antigo
venda_vista_assinatura_manual_2_testemunhas.docx.
</commit_message>
<xml_diff>
--- a/templates/venda_vista_master.docx
+++ b/templates/venda_vista_master.docx
@@ -925,6 +925,13 @@
           <w:szCs w:val="24"/>
         </w:rPr>
       </w:pPr>
+      <w:r>
+        <w:rPr>
+          <w:sz w:val="24"/>
+          <w:szCs w:val="24"/>
+        </w:rPr>
+        <w:t>Testemunha 1:</w:t>
+      </w:r>
     </w:p>
     <w:p>
       <w:pPr>
@@ -1026,6 +1033,13 @@
           <w:szCs w:val="24"/>
         </w:rPr>
       </w:pPr>
+      <w:r>
+        <w:rPr>
+          <w:sz w:val="24"/>
+          <w:szCs w:val="24"/>
+        </w:rPr>
+        <w:t>Testemunha 2:</w:t>
+      </w:r>
     </w:p>
     <w:p>
       <w:pPr>

</xml_diff>